<commit_message>
Fill missing unit-exam figures for U2–U5 (angles, arrowed verticals, compass, constructions).
Co-authored-by: Cursor <cursoragent@cursor.com>
</commit_message>
<xml_diff>
--- a/printables/u02/04-考前测试/U2_四上_第二单元_角的度量.docx
+++ b/printables/u02/04-考前测试/U2_四上_第二单元_角的度量.docx
@@ -62,6 +62,20 @@
     </w:p>
     <w:p>
       <w:pPr>
+        <w:spacing w:before="0" w:after="80" w:line="240" w:lineRule="auto"/>
+      </w:pPr>
+      <w:r>
+        <w:rPr>
+          <w:rFonts w:ascii="宋体" w:hAnsi="宋体" w:eastAsia="宋体"/>
+          <w:b w:val="0"/>
+          <w:color w:val="1E7EB8"/>
+          <w:sz w:val="18"/>
+        </w:rPr>
+        <w:t>【说明】图题已按原卷重绘为高清示意图。</w:t>
+      </w:r>
+    </w:p>
+    <w:p>
+      <w:pPr>
         <w:spacing w:before="160" w:after="120" w:line="240" w:lineRule="auto"/>
       </w:pPr>
       <w:r>
@@ -110,7 +124,47 @@
           <w:b w:val="0"/>
           <w:sz w:val="22"/>
         </w:rPr>
-        <w:t>3. 量角器上箭头指在 180° 位置，表示（　　）角；请用“△”标出周角的位置（与射线重合再转一周）。</w:t>
+        <w:t>3. 下图中箭头所指的位置表示（　　）角；请你用“△”标出周角的位置。</w:t>
+      </w:r>
+    </w:p>
+    <w:p>
+      <w:pPr>
+        <w:spacing w:after="120"/>
+        <w:jc w:val="center"/>
+      </w:pPr>
+      <w:r>
+        <w:drawing>
+          <wp:inline xmlns:a="http://schemas.openxmlformats.org/drawingml/2006/main" xmlns:pic="http://schemas.openxmlformats.org/drawingml/2006/picture">
+            <wp:extent cx="5400000" cy="1260000"/>
+            <wp:docPr id="1" name="Picture 1"/>
+            <wp:cNvGraphicFramePr>
+              <a:graphicFrameLocks noChangeAspect="1"/>
+            </wp:cNvGraphicFramePr>
+            <a:graphic>
+              <a:graphicData uri="http://schemas.openxmlformats.org/drawingml/2006/picture">
+                <pic:pic>
+                  <pic:nvPicPr>
+                    <pic:cNvPr id="0" name="u2_degree_ray_exact.jpg"/>
+                    <pic:cNvPicPr/>
+                  </pic:nvPicPr>
+                  <pic:blipFill>
+                    <a:blip r:embed="rId9"/>
+                    <a:stretch>
+                      <a:fillRect/>
+                    </a:stretch>
+                  </pic:blipFill>
+                  <pic:spPr>
+                    <a:xfrm>
+                      <a:off x="0" y="0"/>
+                      <a:ext cx="5400000" cy="1260000"/>
+                    </a:xfrm>
+                    <a:prstGeom prst="rect"/>
+                  </pic:spPr>
+                </pic:pic>
+              </a:graphicData>
+            </a:graphic>
+          </wp:inline>
+        </w:drawing>
       </w:r>
     </w:p>
     <w:p>
@@ -136,7 +190,47 @@
           <w:b w:val="0"/>
           <w:sz w:val="22"/>
         </w:rPr>
-        <w:t>5. 半圆形材料做成的“量角器”被分成 9 个同样大的角。若 ∠1 占其中 2 份，则 ∠1＝（　　）°。</w:t>
+        <w:t>5. 如右图，半圆形材料做成的“量角器”被分成 9 个同样大的角。若 ∠1 占其中 2 份，则 ∠1＝（　　）°。</w:t>
+      </w:r>
+    </w:p>
+    <w:p>
+      <w:pPr>
+        <w:spacing w:after="120"/>
+        <w:jc w:val="center"/>
+      </w:pPr>
+      <w:r>
+        <w:drawing>
+          <wp:inline xmlns:a="http://schemas.openxmlformats.org/drawingml/2006/main" xmlns:pic="http://schemas.openxmlformats.org/drawingml/2006/picture">
+            <wp:extent cx="3240000" cy="1944000"/>
+            <wp:docPr id="2" name="Picture 2"/>
+            <wp:cNvGraphicFramePr>
+              <a:graphicFrameLocks noChangeAspect="1"/>
+            </wp:cNvGraphicFramePr>
+            <a:graphic>
+              <a:graphicData uri="http://schemas.openxmlformats.org/drawingml/2006/picture">
+                <pic:pic>
+                  <pic:nvPicPr>
+                    <pic:cNvPr id="0" name="u2_9sector_exact.jpg"/>
+                    <pic:cNvPicPr/>
+                  </pic:nvPicPr>
+                  <pic:blipFill>
+                    <a:blip r:embed="rId10"/>
+                    <a:stretch>
+                      <a:fillRect/>
+                    </a:stretch>
+                  </pic:blipFill>
+                  <pic:spPr>
+                    <a:xfrm>
+                      <a:off x="0" y="0"/>
+                      <a:ext cx="3240000" cy="1944000"/>
+                    </a:xfrm>
+                    <a:prstGeom prst="rect"/>
+                  </pic:spPr>
+                </pic:pic>
+              </a:graphicData>
+            </a:graphic>
+          </wp:inline>
+        </w:drawing>
       </w:r>
     </w:p>
     <w:p>
@@ -202,7 +296,47 @@
           <w:b w:val="0"/>
           <w:sz w:val="22"/>
         </w:rPr>
-        <w:t>2. 收费亭转杆升起过程中，与竖杆形成的角的变化情况为（　　）。</w:t>
+        <w:t>2. 如图，收费亭转杆升起过程中，与竖杆形成的角的变化情况为（　　）。</w:t>
+      </w:r>
+    </w:p>
+    <w:p>
+      <w:pPr>
+        <w:spacing w:after="120"/>
+        <w:jc w:val="center"/>
+      </w:pPr>
+      <w:r>
+        <w:drawing>
+          <wp:inline xmlns:a="http://schemas.openxmlformats.org/drawingml/2006/main" xmlns:pic="http://schemas.openxmlformats.org/drawingml/2006/picture">
+            <wp:extent cx="5040000" cy="1466182"/>
+            <wp:docPr id="3" name="Picture 3"/>
+            <wp:cNvGraphicFramePr>
+              <a:graphicFrameLocks noChangeAspect="1"/>
+            </wp:cNvGraphicFramePr>
+            <a:graphic>
+              <a:graphicData uri="http://schemas.openxmlformats.org/drawingml/2006/picture">
+                <pic:pic>
+                  <pic:nvPicPr>
+                    <pic:cNvPr id="0" name="u2_toll_exact.jpg"/>
+                    <pic:cNvPicPr/>
+                  </pic:nvPicPr>
+                  <pic:blipFill>
+                    <a:blip r:embed="rId11"/>
+                    <a:stretch>
+                      <a:fillRect/>
+                    </a:stretch>
+                  </pic:blipFill>
+                  <pic:spPr>
+                    <a:xfrm>
+                      <a:off x="0" y="0"/>
+                      <a:ext cx="5040000" cy="1466182"/>
+                    </a:xfrm>
+                    <a:prstGeom prst="rect"/>
+                  </pic:spPr>
+                </pic:pic>
+              </a:graphicData>
+            </a:graphic>
+          </wp:inline>
+        </w:drawing>
       </w:r>
     </w:p>
     <w:p>
@@ -228,7 +362,47 @@
           <w:b w:val="0"/>
           <w:sz w:val="22"/>
         </w:rPr>
-        <w:t>3. 椅背与椅面夹角宜在 103°～112°，下面各图中符合要求的是（　　）。（按实图选择）</w:t>
+        <w:t>3. 椅背与椅面夹角宜在 103°～112°，下面各图中符合要求的是（　　）。</w:t>
+      </w:r>
+    </w:p>
+    <w:p>
+      <w:pPr>
+        <w:spacing w:after="120"/>
+        <w:jc w:val="center"/>
+      </w:pPr>
+      <w:r>
+        <w:drawing>
+          <wp:inline xmlns:a="http://schemas.openxmlformats.org/drawingml/2006/main" xmlns:pic="http://schemas.openxmlformats.org/drawingml/2006/picture">
+            <wp:extent cx="5400000" cy="1530000"/>
+            <wp:docPr id="4" name="Picture 4"/>
+            <wp:cNvGraphicFramePr>
+              <a:graphicFrameLocks noChangeAspect="1"/>
+            </wp:cNvGraphicFramePr>
+            <a:graphic>
+              <a:graphicData uri="http://schemas.openxmlformats.org/drawingml/2006/picture">
+                <pic:pic>
+                  <pic:nvPicPr>
+                    <pic:cNvPr id="0" name="u2_chairs_exact.jpg"/>
+                    <pic:cNvPicPr/>
+                  </pic:nvPicPr>
+                  <pic:blipFill>
+                    <a:blip r:embed="rId12"/>
+                    <a:stretch>
+                      <a:fillRect/>
+                    </a:stretch>
+                  </pic:blipFill>
+                  <pic:spPr>
+                    <a:xfrm>
+                      <a:off x="0" y="0"/>
+                      <a:ext cx="5400000" cy="1530000"/>
+                    </a:xfrm>
+                    <a:prstGeom prst="rect"/>
+                  </pic:spPr>
+                </pic:pic>
+              </a:graphicData>
+            </a:graphic>
+          </wp:inline>
+        </w:drawing>
       </w:r>
     </w:p>
     <w:p>
@@ -242,6 +416,46 @@
           <w:sz w:val="22"/>
         </w:rPr>
         <w:t>4. 长方形纸折叠后，∠1 的度数是（　　）。</w:t>
+      </w:r>
+    </w:p>
+    <w:p>
+      <w:pPr>
+        <w:spacing w:after="120"/>
+        <w:jc w:val="center"/>
+      </w:pPr>
+      <w:r>
+        <w:drawing>
+          <wp:inline xmlns:a="http://schemas.openxmlformats.org/drawingml/2006/main" xmlns:pic="http://schemas.openxmlformats.org/drawingml/2006/picture">
+            <wp:extent cx="3240000" cy="1944000"/>
+            <wp:docPr id="5" name="Picture 5"/>
+            <wp:cNvGraphicFramePr>
+              <a:graphicFrameLocks noChangeAspect="1"/>
+            </wp:cNvGraphicFramePr>
+            <a:graphic>
+              <a:graphicData uri="http://schemas.openxmlformats.org/drawingml/2006/picture">
+                <pic:pic>
+                  <pic:nvPicPr>
+                    <pic:cNvPr id="0" name="u2_fold_rect_exact.jpg"/>
+                    <pic:cNvPicPr/>
+                  </pic:nvPicPr>
+                  <pic:blipFill>
+                    <a:blip r:embed="rId13"/>
+                    <a:stretch>
+                      <a:fillRect/>
+                    </a:stretch>
+                  </pic:blipFill>
+                  <pic:spPr>
+                    <a:xfrm>
+                      <a:off x="0" y="0"/>
+                      <a:ext cx="3240000" cy="1944000"/>
+                    </a:xfrm>
+                    <a:prstGeom prst="rect"/>
+                  </pic:spPr>
+                </pic:pic>
+              </a:graphicData>
+            </a:graphic>
+          </wp:inline>
+        </w:drawing>
       </w:r>
     </w:p>
     <w:p>
@@ -268,6 +482,46 @@
           <w:sz w:val="22"/>
         </w:rPr>
         <w:t>5. 入门道与地面夹角约 10°，高级道更陡，夹角大约是（　　）。</w:t>
+      </w:r>
+    </w:p>
+    <w:p>
+      <w:pPr>
+        <w:spacing w:after="120"/>
+        <w:jc w:val="center"/>
+      </w:pPr>
+      <w:r>
+        <w:drawing>
+          <wp:inline xmlns:a="http://schemas.openxmlformats.org/drawingml/2006/main" xmlns:pic="http://schemas.openxmlformats.org/drawingml/2006/picture">
+            <wp:extent cx="4680000" cy="1872000"/>
+            <wp:docPr id="6" name="Picture 6"/>
+            <wp:cNvGraphicFramePr>
+              <a:graphicFrameLocks noChangeAspect="1"/>
+            </wp:cNvGraphicFramePr>
+            <a:graphic>
+              <a:graphicData uri="http://schemas.openxmlformats.org/drawingml/2006/picture">
+                <pic:pic>
+                  <pic:nvPicPr>
+                    <pic:cNvPr id="0" name="u2_ski_exact.jpg"/>
+                    <pic:cNvPicPr/>
+                  </pic:nvPicPr>
+                  <pic:blipFill>
+                    <a:blip r:embed="rId14"/>
+                    <a:stretch>
+                      <a:fillRect/>
+                    </a:stretch>
+                  </pic:blipFill>
+                  <pic:spPr>
+                    <a:xfrm>
+                      <a:off x="0" y="0"/>
+                      <a:ext cx="4680000" cy="1872000"/>
+                    </a:xfrm>
+                    <a:prstGeom prst="rect"/>
+                  </pic:spPr>
+                </pic:pic>
+              </a:graphicData>
+            </a:graphic>
+          </wp:inline>
+        </w:drawing>
       </w:r>
     </w:p>
     <w:p>
@@ -327,7 +581,47 @@
           <w:b w:val="0"/>
           <w:sz w:val="22"/>
         </w:rPr>
-        <w:t>1. 先估计，再量一量图中各角的度数并填写。（请自备量角器在草稿上画角后量）</w:t>
+        <w:t>1. 先估计，再量一量图中各角的度数并填写。</w:t>
+      </w:r>
+    </w:p>
+    <w:p>
+      <w:pPr>
+        <w:spacing w:after="120"/>
+        <w:jc w:val="center"/>
+      </w:pPr>
+      <w:r>
+        <w:drawing>
+          <wp:inline xmlns:a="http://schemas.openxmlformats.org/drawingml/2006/main" xmlns:pic="http://schemas.openxmlformats.org/drawingml/2006/picture">
+            <wp:extent cx="5040000" cy="1924364"/>
+            <wp:docPr id="7" name="Picture 7"/>
+            <wp:cNvGraphicFramePr>
+              <a:graphicFrameLocks noChangeAspect="1"/>
+            </wp:cNvGraphicFramePr>
+            <a:graphic>
+              <a:graphicData uri="http://schemas.openxmlformats.org/drawingml/2006/picture">
+                <pic:pic>
+                  <pic:nvPicPr>
+                    <pic:cNvPr id="0" name="u2_measure_angles_exact.jpg"/>
+                    <pic:cNvPicPr/>
+                  </pic:nvPicPr>
+                  <pic:blipFill>
+                    <a:blip r:embed="rId15"/>
+                    <a:stretch>
+                      <a:fillRect/>
+                    </a:stretch>
+                  </pic:blipFill>
+                  <pic:spPr>
+                    <a:xfrm>
+                      <a:off x="0" y="0"/>
+                      <a:ext cx="5040000" cy="1924364"/>
+                    </a:xfrm>
+                    <a:prstGeom prst="rect"/>
+                  </pic:spPr>
+                </pic:pic>
+              </a:graphicData>
+            </a:graphic>
+          </wp:inline>
+        </w:drawing>
       </w:r>
     </w:p>
     <w:p>
@@ -358,6 +652,46 @@
     </w:p>
     <w:p>
       <w:pPr>
+        <w:spacing w:after="120"/>
+        <w:jc w:val="center"/>
+      </w:pPr>
+      <w:r>
+        <w:drawing>
+          <wp:inline xmlns:a="http://schemas.openxmlformats.org/drawingml/2006/main" xmlns:pic="http://schemas.openxmlformats.org/drawingml/2006/picture">
+            <wp:extent cx="5040000" cy="1741091"/>
+            <wp:docPr id="8" name="Picture 8"/>
+            <wp:cNvGraphicFramePr>
+              <a:graphicFrameLocks noChangeAspect="1"/>
+            </wp:cNvGraphicFramePr>
+            <a:graphic>
+              <a:graphicData uri="http://schemas.openxmlformats.org/drawingml/2006/picture">
+                <pic:pic>
+                  <pic:nvPicPr>
+                    <pic:cNvPr id="0" name="u2_draw_boxes_exact.jpg"/>
+                    <pic:cNvPicPr/>
+                  </pic:nvPicPr>
+                  <pic:blipFill>
+                    <a:blip r:embed="rId16"/>
+                    <a:stretch>
+                      <a:fillRect/>
+                    </a:stretch>
+                  </pic:blipFill>
+                  <pic:spPr>
+                    <a:xfrm>
+                      <a:off x="0" y="0"/>
+                      <a:ext cx="5040000" cy="1741091"/>
+                    </a:xfrm>
+                    <a:prstGeom prst="rect"/>
+                  </pic:spPr>
+                </pic:pic>
+              </a:graphicData>
+            </a:graphic>
+          </wp:inline>
+        </w:drawing>
+      </w:r>
+    </w:p>
+    <w:p>
+      <w:pPr>
         <w:spacing w:before="0" w:after="80" w:line="240" w:lineRule="auto"/>
       </w:pPr>
       <w:r>
@@ -384,15 +718,42 @@
     </w:p>
     <w:p>
       <w:pPr>
-        <w:spacing w:before="0" w:after="80" w:line="240" w:lineRule="auto"/>
+        <w:spacing w:after="120"/>
+        <w:jc w:val="center"/>
       </w:pPr>
       <w:r>
-        <w:rPr>
-          <w:rFonts w:ascii="宋体" w:hAnsi="宋体" w:eastAsia="宋体"/>
-          <w:b w:val="0"/>
-          <w:sz w:val="22"/>
-        </w:rPr>
-        <w:t xml:space="preserve">　　整圆：360°（周角）→ 对折一次：（　　）°（　　）角</w:t>
+        <w:drawing>
+          <wp:inline xmlns:a="http://schemas.openxmlformats.org/drawingml/2006/main" xmlns:pic="http://schemas.openxmlformats.org/drawingml/2006/picture">
+            <wp:extent cx="5580000" cy="1674000"/>
+            <wp:docPr id="9" name="Picture 9"/>
+            <wp:cNvGraphicFramePr>
+              <a:graphicFrameLocks noChangeAspect="1"/>
+            </wp:cNvGraphicFramePr>
+            <a:graphic>
+              <a:graphicData uri="http://schemas.openxmlformats.org/drawingml/2006/picture">
+                <pic:pic>
+                  <pic:nvPicPr>
+                    <pic:cNvPr id="0" name="u2_circle_fold_exact.jpg"/>
+                    <pic:cNvPicPr/>
+                  </pic:nvPicPr>
+                  <pic:blipFill>
+                    <a:blip r:embed="rId17"/>
+                    <a:stretch>
+                      <a:fillRect/>
+                    </a:stretch>
+                  </pic:blipFill>
+                  <pic:spPr>
+                    <a:xfrm>
+                      <a:off x="0" y="0"/>
+                      <a:ext cx="5580000" cy="1674000"/>
+                    </a:xfrm>
+                    <a:prstGeom prst="rect"/>
+                  </pic:spPr>
+                </pic:pic>
+              </a:graphicData>
+            </a:graphic>
+          </wp:inline>
+        </w:drawing>
       </w:r>
     </w:p>
     <w:p>
@@ -405,7 +766,47 @@
           <w:b w:val="0"/>
           <w:sz w:val="22"/>
         </w:rPr>
-        <w:t xml:space="preserve">　　→ 再对折：（　　）°（　　）角 → 再对折：（　　）°（　　）角</w:t>
+        <w:t>4. 填出三角尺上每个角的度数。</w:t>
+      </w:r>
+    </w:p>
+    <w:p>
+      <w:pPr>
+        <w:spacing w:after="120"/>
+        <w:jc w:val="center"/>
+      </w:pPr>
+      <w:r>
+        <w:drawing>
+          <wp:inline xmlns:a="http://schemas.openxmlformats.org/drawingml/2006/main" xmlns:pic="http://schemas.openxmlformats.org/drawingml/2006/picture">
+            <wp:extent cx="5040000" cy="1924364"/>
+            <wp:docPr id="10" name="Picture 10"/>
+            <wp:cNvGraphicFramePr>
+              <a:graphicFrameLocks noChangeAspect="1"/>
+            </wp:cNvGraphicFramePr>
+            <a:graphic>
+              <a:graphicData uri="http://schemas.openxmlformats.org/drawingml/2006/picture">
+                <pic:pic>
+                  <pic:nvPicPr>
+                    <pic:cNvPr id="0" name="u2_set_squares_exact.jpg"/>
+                    <pic:cNvPicPr/>
+                  </pic:nvPicPr>
+                  <pic:blipFill>
+                    <a:blip r:embed="rId18"/>
+                    <a:stretch>
+                      <a:fillRect/>
+                    </a:stretch>
+                  </pic:blipFill>
+                  <pic:spPr>
+                    <a:xfrm>
+                      <a:off x="0" y="0"/>
+                      <a:ext cx="5040000" cy="1924364"/>
+                    </a:xfrm>
+                    <a:prstGeom prst="rect"/>
+                  </pic:spPr>
+                </pic:pic>
+              </a:graphicData>
+            </a:graphic>
+          </wp:inline>
+        </w:drawing>
       </w:r>
     </w:p>
     <w:p>
@@ -418,20 +819,47 @@
           <w:b w:val="0"/>
           <w:sz w:val="22"/>
         </w:rPr>
-        <w:t>4. 填出三角尺上每个角的度数：45°-45°-90°；30°-60°-90°。</w:t>
+        <w:t xml:space="preserve">　　拼角：按图填写。</w:t>
       </w:r>
     </w:p>
     <w:p>
       <w:pPr>
-        <w:spacing w:before="0" w:after="80" w:line="240" w:lineRule="auto"/>
+        <w:spacing w:after="120"/>
+        <w:jc w:val="center"/>
       </w:pPr>
       <w:r>
-        <w:rPr>
-          <w:rFonts w:ascii="宋体" w:hAnsi="宋体" w:eastAsia="宋体"/>
-          <w:b w:val="0"/>
-          <w:sz w:val="22"/>
-        </w:rPr>
-        <w:t xml:space="preserve">　　拼角：∠1＝90°＋45°＝（　　）°；∠2＝60°＋45°＝（　　）°；∠3＝（　　）°（按图）。</w:t>
+        <w:drawing>
+          <wp:inline xmlns:a="http://schemas.openxmlformats.org/drawingml/2006/main" xmlns:pic="http://schemas.openxmlformats.org/drawingml/2006/picture">
+            <wp:extent cx="5400000" cy="1710000"/>
+            <wp:docPr id="11" name="Picture 11"/>
+            <wp:cNvGraphicFramePr>
+              <a:graphicFrameLocks noChangeAspect="1"/>
+            </wp:cNvGraphicFramePr>
+            <a:graphic>
+              <a:graphicData uri="http://schemas.openxmlformats.org/drawingml/2006/picture">
+                <pic:pic>
+                  <pic:nvPicPr>
+                    <pic:cNvPr id="0" name="u2_compose_angles_exact.jpg"/>
+                    <pic:cNvPicPr/>
+                  </pic:nvPicPr>
+                  <pic:blipFill>
+                    <a:blip r:embed="rId19"/>
+                    <a:stretch>
+                      <a:fillRect/>
+                    </a:stretch>
+                  </pic:blipFill>
+                  <pic:spPr>
+                    <a:xfrm>
+                      <a:off x="0" y="0"/>
+                      <a:ext cx="5400000" cy="1710000"/>
+                    </a:xfrm>
+                    <a:prstGeom prst="rect"/>
+                  </pic:spPr>
+                </pic:pic>
+              </a:graphicData>
+            </a:graphic>
+          </wp:inline>
+        </w:drawing>
       </w:r>
     </w:p>
     <w:p>
@@ -464,33 +892,47 @@
           <w:b w:val="0"/>
           <w:sz w:val="22"/>
         </w:rPr>
-        <w:t>5. 求出下面图中指定角的度数。（示意图用文字描述）</w:t>
+        <w:t>5. 求出下面图中指定角的度数。</w:t>
       </w:r>
     </w:p>
     <w:p>
       <w:pPr>
-        <w:spacing w:before="0" w:after="80" w:line="240" w:lineRule="auto"/>
+        <w:spacing w:after="120"/>
+        <w:jc w:val="center"/>
       </w:pPr>
       <w:r>
-        <w:rPr>
-          <w:rFonts w:ascii="宋体" w:hAnsi="宋体" w:eastAsia="宋体"/>
-          <w:b w:val="0"/>
-          <w:sz w:val="22"/>
-        </w:rPr>
-        <w:t xml:space="preserve">　　(1) 平角上，∠1＝90°，∠2＝45°，则 ∠3＝（　　）°。</w:t>
-      </w:r>
-    </w:p>
-    <w:p>
-      <w:pPr>
-        <w:spacing w:before="0" w:after="80" w:line="240" w:lineRule="auto"/>
-      </w:pPr>
-      <w:r>
-        <w:rPr>
-          <w:rFonts w:ascii="宋体" w:hAnsi="宋体" w:eastAsia="宋体"/>
-          <w:b w:val="0"/>
-          <w:sz w:val="22"/>
-        </w:rPr>
-        <w:t xml:space="preserve">　　(2) 互相垂直的两条直线，∠1＝90°，∠2＝∠3，求 ∠4、∠5 及 ∠2＋∠3＋∠4＋∠5。</w:t>
+        <w:drawing>
+          <wp:inline xmlns:a="http://schemas.openxmlformats.org/drawingml/2006/main" xmlns:pic="http://schemas.openxmlformats.org/drawingml/2006/picture">
+            <wp:extent cx="5580000" cy="1953000"/>
+            <wp:docPr id="12" name="Picture 12"/>
+            <wp:cNvGraphicFramePr>
+              <a:graphicFrameLocks noChangeAspect="1"/>
+            </wp:cNvGraphicFramePr>
+            <a:graphic>
+              <a:graphicData uri="http://schemas.openxmlformats.org/drawingml/2006/picture">
+                <pic:pic>
+                  <pic:nvPicPr>
+                    <pic:cNvPr id="0" name="u2_intersect_exact.jpg"/>
+                    <pic:cNvPicPr/>
+                  </pic:nvPicPr>
+                  <pic:blipFill>
+                    <a:blip r:embed="rId20"/>
+                    <a:stretch>
+                      <a:fillRect/>
+                    </a:stretch>
+                  </pic:blipFill>
+                  <pic:spPr>
+                    <a:xfrm>
+                      <a:off x="0" y="0"/>
+                      <a:ext cx="5580000" cy="1953000"/>
+                    </a:xfrm>
+                    <a:prstGeom prst="rect"/>
+                  </pic:spPr>
+                </pic:pic>
+              </a:graphicData>
+            </a:graphic>
+          </wp:inline>
+        </w:drawing>
       </w:r>
     </w:p>
     <w:p>
@@ -508,6 +950,46 @@
     </w:p>
     <w:p>
       <w:pPr>
+        <w:spacing w:after="120"/>
+        <w:jc w:val="center"/>
+      </w:pPr>
+      <w:r>
+        <w:drawing>
+          <wp:inline xmlns:a="http://schemas.openxmlformats.org/drawingml/2006/main" xmlns:pic="http://schemas.openxmlformats.org/drawingml/2006/picture">
+            <wp:extent cx="4320000" cy="2304000"/>
+            <wp:docPr id="13" name="Picture 13"/>
+            <wp:cNvGraphicFramePr>
+              <a:graphicFrameLocks noChangeAspect="1"/>
+            </wp:cNvGraphicFramePr>
+            <a:graphic>
+              <a:graphicData uri="http://schemas.openxmlformats.org/drawingml/2006/picture">
+                <pic:pic>
+                  <pic:nvPicPr>
+                    <pic:cNvPr id="0" name="u2_broken_protractor_exact.jpg"/>
+                    <pic:cNvPicPr/>
+                  </pic:nvPicPr>
+                  <pic:blipFill>
+                    <a:blip r:embed="rId21"/>
+                    <a:stretch>
+                      <a:fillRect/>
+                    </a:stretch>
+                  </pic:blipFill>
+                  <pic:spPr>
+                    <a:xfrm>
+                      <a:off x="0" y="0"/>
+                      <a:ext cx="4320000" cy="2304000"/>
+                    </a:xfrm>
+                    <a:prstGeom prst="rect"/>
+                  </pic:spPr>
+                </pic:pic>
+              </a:graphicData>
+            </a:graphic>
+          </wp:inline>
+        </w:drawing>
+      </w:r>
+    </w:p>
+    <w:p>
+      <w:pPr>
         <w:spacing w:before="0" w:after="80" w:line="240" w:lineRule="auto"/>
       </w:pPr>
       <w:r>
@@ -516,7 +998,47 @@
           <w:b w:val="0"/>
           <w:sz w:val="22"/>
         </w:rPr>
-        <w:t>7. 折纸飞机：∠1＝60°，求 ∠2＝（　　）°。</w:t>
+        <w:t>7. 折纸飞机：已知 ∠1＝60°，求 ∠2＝（　　）°。</w:t>
+      </w:r>
+    </w:p>
+    <w:p>
+      <w:pPr>
+        <w:spacing w:after="120"/>
+        <w:jc w:val="center"/>
+      </w:pPr>
+      <w:r>
+        <w:drawing>
+          <wp:inline xmlns:a="http://schemas.openxmlformats.org/drawingml/2006/main" xmlns:pic="http://schemas.openxmlformats.org/drawingml/2006/picture">
+            <wp:extent cx="5040000" cy="1924364"/>
+            <wp:docPr id="14" name="Picture 14"/>
+            <wp:cNvGraphicFramePr>
+              <a:graphicFrameLocks noChangeAspect="1"/>
+            </wp:cNvGraphicFramePr>
+            <a:graphic>
+              <a:graphicData uri="http://schemas.openxmlformats.org/drawingml/2006/picture">
+                <pic:pic>
+                  <pic:nvPicPr>
+                    <pic:cNvPr id="0" name="u2_plane_fold_exact.jpg"/>
+                    <pic:cNvPicPr/>
+                  </pic:nvPicPr>
+                  <pic:blipFill>
+                    <a:blip r:embed="rId22"/>
+                    <a:stretch>
+                      <a:fillRect/>
+                    </a:stretch>
+                  </pic:blipFill>
+                  <pic:spPr>
+                    <a:xfrm>
+                      <a:off x="0" y="0"/>
+                      <a:ext cx="5040000" cy="1924364"/>
+                    </a:xfrm>
+                    <a:prstGeom prst="rect"/>
+                  </pic:spPr>
+                </pic:pic>
+              </a:graphicData>
+            </a:graphic>
+          </wp:inline>
+        </w:drawing>
       </w:r>
     </w:p>
     <w:p>
@@ -530,6 +1052,46 @@
           <w:sz w:val="22"/>
         </w:rPr>
         <w:t>8. 放风筝：线长相同。</w:t>
+      </w:r>
+    </w:p>
+    <w:p>
+      <w:pPr>
+        <w:spacing w:after="120"/>
+        <w:jc w:val="center"/>
+      </w:pPr>
+      <w:r>
+        <w:drawing>
+          <wp:inline xmlns:a="http://schemas.openxmlformats.org/drawingml/2006/main" xmlns:pic="http://schemas.openxmlformats.org/drawingml/2006/picture">
+            <wp:extent cx="5040000" cy="2199273"/>
+            <wp:docPr id="15" name="Picture 15"/>
+            <wp:cNvGraphicFramePr>
+              <a:graphicFrameLocks noChangeAspect="1"/>
+            </wp:cNvGraphicFramePr>
+            <a:graphic>
+              <a:graphicData uri="http://schemas.openxmlformats.org/drawingml/2006/picture">
+                <pic:pic>
+                  <pic:nvPicPr>
+                    <pic:cNvPr id="0" name="u2_kites_exact.jpg"/>
+                    <pic:cNvPicPr/>
+                  </pic:nvPicPr>
+                  <pic:blipFill>
+                    <a:blip r:embed="rId23"/>
+                    <a:stretch>
+                      <a:fillRect/>
+                    </a:stretch>
+                  </pic:blipFill>
+                  <pic:spPr>
+                    <a:xfrm>
+                      <a:off x="0" y="0"/>
+                      <a:ext cx="5040000" cy="2199273"/>
+                    </a:xfrm>
+                    <a:prstGeom prst="rect"/>
+                  </pic:spPr>
+                </pic:pic>
+              </a:graphicData>
+            </a:graphic>
+          </wp:inline>
+        </w:drawing>
       </w:r>
     </w:p>
     <w:p>

</xml_diff>